<commit_message>
Document keeping the password hash out of the repository
The section the previous commit meant to add. Its edit failed its own assertion
— it was written against a heading from a different guide — and a newline where
an && belonged meant the commit went ahead without it anyway.

Covers why the committed settings-password.js is blank, that a hash is not a
password but is still worth not publishing in a public repository that keeps
history, and the --flow-config / --settings-password pair for building from
files kept outside the checkout.

Co-Authored-By: Claude Opus 5 <noreply@anthropic.com>
Claude-Session: https://claude.ai/code/session_01R3SHvZxDNeDF7H2ECUwwcs
</commit_message>
<xml_diff>
--- a/docs/word/5 - Locking Settings with a Password.docx
+++ b/docs/word/5 - Locking Settings with a Password.docx
@@ -1056,6 +1056,174 @@
           <w:sz w:val="30"/>
           <w:szCs w:val="30"/>
         </w:rPr>
+        <w:t xml:space="preserve">Keeping it out of the repository</w:t>
+      </w:r>
+    </w:p>
+    <w:p>
+      <w:pPr>
+        <w:spacing w:after="160" w:line="276"/>
+      </w:pPr>
+      <w:r>
+        <w:rPr>
+          <w:rFonts w:ascii="Arial" w:cs="Arial" w:eastAsia="Arial" w:hAnsi="Arial"/>
+          <w:color w:val="1C2B3A"/>
+          <w:sz w:val="20"/>
+          <w:szCs w:val="20"/>
+        </w:rPr>
+        <w:t xml:space="preserve">This repository is public, so the committed </w:t>
+      </w:r>
+      <w:r>
+        <w:rPr>
+          <w:rFonts w:ascii="Consolas" w:cs="Consolas" w:eastAsia="Consolas" w:hAnsi="Consolas"/>
+          <w:color w:val="2A4258"/>
+          <w:sz w:val="18"/>
+          <w:szCs w:val="18"/>
+          <w:shd w:fill="F2F0EA" w:val="clear"/>
+        </w:rPr>
+        <w:t xml:space="preserve">assets/settings-password.js</w:t>
+      </w:r>
+      <w:r>
+        <w:rPr>
+          <w:rFonts w:ascii="Arial" w:cs="Arial" w:eastAsia="Arial" w:hAnsi="Arial"/>
+          <w:color w:val="1C2B3A"/>
+          <w:sz w:val="20"/>
+          <w:szCs w:val="20"/>
+        </w:rPr>
+        <w:t xml:space="preserve"> is blank. A password hash is designed to ship inside the page — it is not the password, and it cannot be turned back into one. But publishing yours in a public repository hands anyone a fixed target to guess against offline at their leisure, and git keeps it even after the file is changed back.</w:t>
+      </w:r>
+    </w:p>
+    <w:p>
+      <w:pPr>
+        <w:spacing w:after="160" w:line="276"/>
+      </w:pPr>
+      <w:r>
+        <w:rPr>
+          <w:rFonts w:ascii="Arial" w:cs="Arial" w:eastAsia="Arial" w:hAnsi="Arial"/>
+          <w:color w:val="1C2B3A"/>
+          <w:sz w:val="20"/>
+          <w:szCs w:val="20"/>
+        </w:rPr>
+        <w:t xml:space="preserve">So keep the filled-in file beside the filled-in </w:t>
+      </w:r>
+      <w:r>
+        <w:rPr>
+          <w:rFonts w:ascii="Consolas" w:cs="Consolas" w:eastAsia="Consolas" w:hAnsi="Consolas"/>
+          <w:color w:val="2A4258"/>
+          <w:sz w:val="18"/>
+          <w:szCs w:val="18"/>
+          <w:shd w:fill="F2F0EA" w:val="clear"/>
+        </w:rPr>
+        <w:t xml:space="preserve">flow-config.js</w:t>
+      </w:r>
+      <w:r>
+        <w:rPr>
+          <w:rFonts w:ascii="Arial" w:cs="Arial" w:eastAsia="Arial" w:hAnsi="Arial"/>
+          <w:color w:val="1C2B3A"/>
+          <w:sz w:val="20"/>
+          <w:szCs w:val="20"/>
+        </w:rPr>
+        <w:t xml:space="preserve">, somewhere that is not the checkout, and point the builder at both:</w:t>
+      </w:r>
+    </w:p>
+    <w:p>
+      <w:pPr>
+        <w:pBdr>
+          <w:left w:val="single" w:color="4C5C6D" w:sz="12" w:space="8"/>
+        </w:pBdr>
+        <w:shd w:fill="F2F0EA" w:val="clear"/>
+        <w:spacing w:after="0" w:before="120"/>
+        <w:ind w:left="220" w:right="220"/>
+      </w:pPr>
+      <w:r>
+        <w:rPr>
+          <w:rFonts w:ascii="Consolas" w:cs="Consolas" w:eastAsia="Consolas" w:hAnsi="Consolas"/>
+          <w:color w:val="1C2B3A"/>
+          <w:sz w:val="17"/>
+          <w:szCs w:val="17"/>
+        </w:rPr>
+        <w:t xml:space="preserve">python3 tools/make-deploy-folder.py \</w:t>
+      </w:r>
+    </w:p>
+    <w:p>
+      <w:pPr>
+        <w:pBdr>
+          <w:left w:val="single" w:color="4C5C6D" w:sz="12" w:space="8"/>
+        </w:pBdr>
+        <w:shd w:fill="F2F0EA" w:val="clear"/>
+        <w:spacing w:after="0" w:before="0"/>
+        <w:ind w:left="220" w:right="220"/>
+      </w:pPr>
+      <w:r>
+        <w:rPr>
+          <w:rFonts w:ascii="Consolas" w:cs="Consolas" w:eastAsia="Consolas" w:hAnsi="Consolas"/>
+          <w:color w:val="1C2B3A"/>
+          <w:sz w:val="17"/>
+          <w:szCs w:val="17"/>
+        </w:rPr>
+        <w:t xml:space="preserve">    --flow-config       ~/axis-private/flow-config.js \</w:t>
+      </w:r>
+    </w:p>
+    <w:p>
+      <w:pPr>
+        <w:pBdr>
+          <w:left w:val="single" w:color="4C5C6D" w:sz="12" w:space="8"/>
+        </w:pBdr>
+        <w:shd w:fill="F2F0EA" w:val="clear"/>
+        <w:spacing w:after="160" w:before="0"/>
+        <w:ind w:left="220" w:right="220"/>
+      </w:pPr>
+      <w:r>
+        <w:rPr>
+          <w:rFonts w:ascii="Consolas" w:cs="Consolas" w:eastAsia="Consolas" w:hAnsi="Consolas"/>
+          <w:color w:val="1C2B3A"/>
+          <w:sz w:val="17"/>
+          <w:szCs w:val="17"/>
+        </w:rPr>
+        <w:t xml:space="preserve">    --settings-password ~/axis-private/settings-password.js</w:t>
+      </w:r>
+    </w:p>
+    <w:p>
+      <w:pPr>
+        <w:spacing w:after="160" w:line="276"/>
+      </w:pPr>
+      <w:r>
+        <w:rPr>
+          <w:rFonts w:ascii="Arial" w:cs="Arial" w:eastAsia="Arial" w:hAnsi="Arial"/>
+          <w:color w:val="1C2B3A"/>
+          <w:sz w:val="20"/>
+          <w:szCs w:val="20"/>
+        </w:rPr>
+        <w:t xml:space="preserve">Both paths are checked before anything is built, so pointing at the wrong file fails immediately rather than destroying the last good build on the way.</w:t>
+      </w:r>
+    </w:p>
+    <w:p>
+      <w:pPr>
+        <w:spacing w:after="160" w:line="276"/>
+      </w:pPr>
+      <w:r>
+        <w:rPr>
+          <w:rFonts w:ascii="Arial" w:cs="Arial" w:eastAsia="Arial" w:hAnsi="Arial"/>
+          <w:color w:val="1C2B3A"/>
+          <w:sz w:val="20"/>
+          <w:szCs w:val="20"/>
+        </w:rPr>
+        <w:t xml:space="preserve">The in-app route needs none of this: the file it downloads goes from your downloads folder straight to Netlify and never touches the repository.</w:t>
+      </w:r>
+    </w:p>
+    <w:p>
+      <w:pPr>
+        <w:pStyle w:val="Heading1"/>
+        <w:spacing w:after="140" w:before="320"/>
+      </w:pPr>
+      <w:r>
+        <w:rPr>
+          <w:rFonts w:ascii="Arial" w:cs="Arial" w:eastAsia="Arial" w:hAnsi="Arial"/>
+          <w:b/>
+          <w:bCs/>
+          <w:color w:val="2A4258"/>
+          <w:sz w:val="30"/>
+          <w:szCs w:val="30"/>
+        </w:rPr>
         <w:t xml:space="preserve">Or, if you have Node installed</w:t>
       </w:r>
     </w:p>

</xml_diff>